<commit_message>
fix: add visuals to corpus PDFs
</commit_message>
<xml_diff>
--- a/sample-data/contoso-indonesia/docx/FIN-001-reimburse-dan-perjalanan-dinas.docx
+++ b/sample-data/contoso-indonesia/docx/FIN-001-reimburse-dan-perjalanan-dinas.docx
@@ -2997,18 +2997,6 @@
         </w:tc>
       </w:tr>
     </w:tbl>
-    <w:p>
-      <w:pPr>
-        <w:spacing w:after="80" w:before="80"/>
-      </w:pPr>
-      <w:r>
-        <w:rPr>
-          <w:b w:val="false"/>
-          <w:bCs w:val="false"/>
-        </w:rPr>
-        <w:t xml:space="preserve">Dokumen ini fiktif dan hanya dipakai untuk latihan Foundry IQ.</w:t>
-      </w:r>
-    </w:p>
     <w:sectPr>
       <w:headerReference w:type="default" r:id="rId7"/>
       <w:footerReference w:type="default" r:id="rId8"/>

</xml_diff>

<commit_message>
docs: align demo prompt with gpt 4.1
</commit_message>
<xml_diff>
--- a/sample-data/contoso-indonesia/docx/FIN-001-reimburse-dan-perjalanan-dinas.docx
+++ b/sample-data/contoso-indonesia/docx/FIN-001-reimburse-dan-perjalanan-dinas.docx
@@ -37,6 +37,31 @@
           <w:bCs w:val="false"/>
         </w:rPr>
         <w:t xml:space="preserve">Dokumen ini berisi aturan klaim biaya operasional dan perjalanan dinas. Tabel limit sengaja dibuat panjang agar PDF pecah halaman dan header tabel harus berulang.</w:t>
+      </w:r>
+    </w:p>
+    <w:p>
+      <w:pPr>
+        <w:pStyle w:val="Heading2"/>
+        <w:spacing w:after="80" w:before="80"/>
+      </w:pPr>
+      <w:r>
+        <w:rPr>
+          <w:b/>
+          <w:bCs/>
+        </w:rPr>
+        <w:t xml:space="preserve">Quick Reference Limit Hotel</w:t>
+      </w:r>
+    </w:p>
+    <w:p>
+      <w:pPr>
+        <w:spacing w:after="80" w:before="80"/>
+      </w:pPr>
+      <w:r>
+        <w:rPr>
+          <w:b w:val="false"/>
+          <w:bCs w:val="false"/>
+        </w:rPr>
+        <w:t xml:space="preserve">Untuk pertanyaan validasi: limit hotel Tier 1 untuk role Staff adalah Rp1.200.000/malam. Angka Rp2.000.000 adalah threshold approval Head of Department, bukan limit hotel.</w:t>
       </w:r>
     </w:p>
     <w:p>

</xml_diff>